<commit_message>
feat(manuscrito): incorporar teoria bi-escala, asimetria del paisaje, test de monotonicidad fisica y hoja de ruta SMAP/Sentinel-3
</commit_message>
<xml_diff>
--- a/cover_letter.docx
+++ b/cover_letter.docx
@@ -697,7 +697,7 @@
           <w:b/>
           <w:bCs/>
         </w:rPr>
-        <w:t xml:space="preserve">37 unit tests</w:t>
+        <w:t xml:space="preserve">38 unit tests</w:t>
       </w:r>
       <w:r>
         <w:t xml:space="preserve"> </w:t>
@@ -736,7 +736,7 @@
         </m:r>
       </m:oMath>
       <w:r>
-        <w:t xml:space="preserve">, verifying algebraic invariants, conformal coverage, and spatial KD-Tree queries. All code and workflows are versioned from raw ingestion (</w:t>
+        <w:t xml:space="preserve">, verifying algebraic invariants, physical monotonicity, conformal coverage, and spatial KD-Tree queries. All code and workflows are versioned from raw ingestion (</w:t>
       </w:r>
       <w:r>
         <w:rPr>

</xml_diff>

<commit_message>
fix(methodology): fix dynamic risk vectorization, enforce anti-leakage benchmarking, synchronize editorial figures and align supplementary tables
</commit_message>
<xml_diff>
--- a/cover_letter.docx
+++ b/cover_letter.docx
@@ -95,7 +95,7 @@
           <w:i/>
           <w:iCs/>
         </w:rPr>
-        <w:t xml:space="preserve">“Decoupling Biophysical Ignition Hazard and Tactical Wildfire Propagation in the Gran Chaco via Multiscale GeoAI (2015–2025)”</w:t>
+        <w:t xml:space="preserve">“Decoupling Biophysical Ignition Hazard and Tactical Wildfire Propagation in the Gran Chaco via Multiscale GeoAI (2018–2025)”</w:t>
       </w:r>
     </w:p>
     <w:p>
@@ -121,7 +121,7 @@
           <w:b/>
           <w:bCs/>
         </w:rPr>
-        <w:t xml:space="preserve">“Decoupling Biophysical Ignition Hazard and Tactical Wildfire Propagation in the Gran Chaco via Multiscale GeoAI (2015–2025): A Reproducible Two-Stage Computational Framework for 24-Hour Forecasting and International Benchmarking Against Canadian FWI and INPE”</w:t>
+        <w:t xml:space="preserve">“Decoupling Biophysical Ignition Hazard and Tactical Wildfire Propagation in the Gran Chaco via Multiscale GeoAI (2018–2025): A Reproducible Two-Stage Computational Framework for 24-Hour Forecasting and International Benchmarking Against Canadian FWI and INPE”</w:t>
       </w:r>
       <w:r>
         <w:t xml:space="preserve">, which we submit for consideration as a</w:t>
@@ -337,7 +337,7 @@
         <w:t xml:space="preserve"> </w:t>
       </w:r>
       <w:r>
-        <w:t xml:space="preserve">over a decadal observation baseline (2015–2025). We analytically decouple the operational task into two distinct models: (i)</w:t>
+        <w:t xml:space="preserve">over an 8-year homogeneous multi-annual observation baseline (2018–2025). This horizon is strictly anchored to the dual-sensor VIIRS 375m constellation (Suomi-NPP and NOAA-20 in continuous orbital tandem), systematically eliminating observational effort bias and ensuring uniform temporal sampling across all modeling phases. We analytically decouple the operational task into two distinct models: (i)</w:t>
       </w:r>
       <w:r>
         <w:t xml:space="preserve"> </w:t>
@@ -697,7 +697,7 @@
           <w:b/>
           <w:bCs/>
         </w:rPr>
-        <w:t xml:space="preserve">38 unit tests</w:t>
+        <w:t xml:space="preserve">40 unit tests</w:t>
       </w:r>
       <w:r>
         <w:t xml:space="preserve"> </w:t>
@@ -742,7 +742,7 @@
         <w:rPr>
           <w:rStyle w:val="VerbatimChar"/>
         </w:rPr>
-        <w:t xml:space="preserve">scripts/01_...</w:t>
+        <w:t xml:space="preserve">scripts/00_...</w:t>
       </w:r>
       <w:r>
         <w:t xml:space="preserve">) to publication-ready outputs (</w:t>
@@ -776,48 +776,94 @@
         <w:t xml:space="preserve"> </w:t>
       </w:r>
       <w:r>
-        <w:t xml:space="preserve">In prospective blind testing, our biophysical ignition layer achieves a ROC-AUC of</w:t>
+        <w:t xml:space="preserve">In prospective blind testing over</w:t>
       </w:r>
       <w:r>
         <w:t xml:space="preserve"> </w:t>
       </w:r>
       <m:oMath>
         <m:r>
-          <m:t>0.8305</m:t>
+          <m:t>1</m:t>
+        </m:r>
+        <m:r>
+          <m:rPr>
+            <m:sty m:val="p"/>
+          </m:rPr>
+          <m:t>,</m:t>
+        </m:r>
+        <m:r>
+          <m:t>841</m:t>
+        </m:r>
+        <m:r>
+          <m:rPr>
+            <m:sty m:val="p"/>
+          </m:rPr>
+          <m:t>,</m:t>
+        </m:r>
+        <m:r>
+          <m:t>147</m:t>
         </m:r>
       </m:oMath>
       <w:r>
         <w:t xml:space="preserve"> </w:t>
       </w:r>
       <w:r>
-        <w:t xml:space="preserve">and PR-AUC of</w:t>
+        <w:t xml:space="preserve">holdout cell-days during the 2024–2025 extreme crisis, our biophysical ignition layer achieves a ROC-AUC of</w:t>
       </w:r>
       <w:r>
         <w:t xml:space="preserve"> </w:t>
       </w:r>
       <m:oMath>
         <m:r>
-          <m:t>0.5714</m:t>
+          <m:t>0.7219</m:t>
         </m:r>
       </m:oMath>
       <w:r>
         <w:t xml:space="preserve"> </w:t>
       </w:r>
       <w:r>
-        <w:t xml:space="preserve">in the Gran Chaco (dramatically outperforming the Canadian FWI at</w:t>
+        <w:t xml:space="preserve">in the Gran Chaco and</w:t>
       </w:r>
       <w:r>
         <w:t xml:space="preserve"> </w:t>
       </w:r>
       <m:oMath>
         <m:r>
-          <m:t>0.5432</m:t>
+          <m:t>0.7978</m:t>
         </m:r>
       </m:oMath>
       <w:r>
         <w:t xml:space="preserve"> </w:t>
       </w:r>
       <w:r>
+        <w:t xml:space="preserve">in the Oriental Region (dramatically outperforming both the Canadian FWI at</w:t>
+      </w:r>
+      <w:r>
+        <w:t xml:space="preserve"> </w:t>
+      </w:r>
+      <m:oMath>
+        <m:r>
+          <m:t>0.5183</m:t>
+        </m:r>
+      </m:oMath>
+      <w:r>
+        <w:t xml:space="preserve"> </w:t>
+      </w:r>
+      <w:r>
+        <w:t xml:space="preserve">/</w:t>
+      </w:r>
+      <w:r>
+        <w:t xml:space="preserve"> </w:t>
+      </w:r>
+      <m:oMath>
+        <m:r>
+          <m:t>0.6055</m:t>
+        </m:r>
+      </m:oMath>
+      <w:r>
+        <w:t xml:space="preserve"> </w:t>
+      </w:r>
+      <w:r>
         <w:t xml:space="preserve">and INPE at</w:t>
       </w:r>
       <w:r>
@@ -825,18 +871,46 @@
       </w:r>
       <m:oMath>
         <m:r>
-          <m:t>0.6457</m:t>
+          <m:t>0.5036</m:t>
         </m:r>
       </m:oMath>
       <w:r>
-        <w:t xml:space="preserve">), while tactical propagation achieves a precision of</w:t>
+        <w:t xml:space="preserve"> </w:t>
+      </w:r>
+      <w:r>
+        <w:t xml:space="preserve">/</w:t>
       </w:r>
       <w:r>
         <w:t xml:space="preserve"> </w:t>
       </w:r>
       <m:oMath>
         <m:r>
-          <m:t>90.16</m:t>
+          <m:t>0.5865</m:t>
+        </m:r>
+      </m:oMath>
+      <w:r>
+        <w:t xml:space="preserve">), while tactical propagation achieves a ROC-AUC of</w:t>
+      </w:r>
+      <w:r>
+        <w:t xml:space="preserve"> </w:t>
+      </w:r>
+      <m:oMath>
+        <m:r>
+          <m:t>0.8741</m:t>
+        </m:r>
+      </m:oMath>
+      <w:r>
+        <w:t xml:space="preserve"> </w:t>
+      </w:r>
+      <w:r>
+        <w:t xml:space="preserve">and a precision of</w:t>
+      </w:r>
+      <w:r>
+        <w:t xml:space="preserve"> </w:t>
+      </w:r>
+      <m:oMath>
+        <m:r>
+          <m:t>86.73</m:t>
         </m:r>
         <m:r>
           <m:rPr>
@@ -850,7 +924,36 @@
         <w:t xml:space="preserve"> </w:t>
       </w:r>
       <w:r>
-        <w:t xml:space="preserve">with only 12 false positives across the entire holdout set.</w:t>
+        <w:t xml:space="preserve">with only 3,552 false positives across the entire holdout set (compared to</w:t>
+      </w:r>
+      <w:r>
+        <w:t xml:space="preserve"> </w:t>
+      </w:r>
+      <m:oMath>
+        <m:r>
+          <m:rPr>
+            <m:sty m:val="p"/>
+          </m:rPr>
+          <m:t>&gt;</m:t>
+        </m:r>
+        <m:r>
+          <m:t>696</m:t>
+        </m:r>
+        <m:r>
+          <m:rPr>
+            <m:sty m:val="p"/>
+          </m:rPr>
+          <m:t>,</m:t>
+        </m:r>
+        <m:r>
+          <m:t>000</m:t>
+        </m:r>
+      </m:oMath>
+      <w:r>
+        <w:t xml:space="preserve"> </w:t>
+      </w:r>
+      <w:r>
+        <w:t xml:space="preserve">false alarms generated by the operational INPE proxy).</w:t>
       </w:r>
     </w:p>
     <w:bookmarkEnd w:id="10"/>

</xml_diff>

<commit_message>
feat(audit): corregir datos, targets D2, modelos, alertas y figuras
</commit_message>
<xml_diff>
--- a/cover_letter.docx
+++ b/cover_letter.docx
@@ -121,7 +121,7 @@
           <w:b/>
           <w:bCs/>
         </w:rPr>
-        <w:t xml:space="preserve">“Decoupling Biophysical Ignition Hazard and Tactical Wildfire Propagation in the Gran Chaco via Multiscale GeoAI (2018–2025): A Reproducible Two-Stage Computational Framework for 24-Hour Forecasting and International Benchmarking Against Canadian FWI and INPE”</w:t>
+        <w:t xml:space="preserve">“Decoupling Biophysical Ignition Hazard and Tactical Wildfire Propagation in the Gran Chaco via Multiscale GeoAI (2018–2025): A Reproducible Two-Stage Computational Framework for Daily Hazard Nowcasting and International Benchmarking Against Canadian FWI and INPE”</w:t>
       </w:r>
       <w:r>
         <w:t xml:space="preserve">, which we submit for consideration as a</w:t>
@@ -347,10 +347,34 @@
           <w:b/>
           <w:bCs/>
         </w:rPr>
-        <w:t xml:space="preserve">Pure Biophysical Ignition</w:t>
-      </w:r>
-      <w:r>
-        <w:t xml:space="preserve">, guided by physics-based monotonic constraints and leakage-free spatial susceptibility priors; and (ii)</w:t>
+        <w:t xml:space="preserve">Multiscale Socio-Ecological Hybrid Ignition</w:t>
+      </w:r>
+      <w:r>
+        <w:t xml:space="preserve"> </w:t>
+      </w:r>
+      <w:r>
+        <w:t xml:space="preserve">(</w:t>
+      </w:r>
+      <m:oMath>
+        <m:sSub>
+          <m:e>
+            <m:r>
+              <m:rPr>
+                <m:scr m:val="script"/>
+                <m:sty m:val="p"/>
+              </m:rPr>
+              <m:t>M</m:t>
+            </m:r>
+          </m:e>
+          <m:sub>
+            <m:r>
+              <m:t>3</m:t>
+            </m:r>
+          </m:sub>
+        </m:sSub>
+      </m:oMath>
+      <w:r>
+        <w:t xml:space="preserve">), guided by physics-based monotonic constraints, ecotone edge gradients, and static anthropogenic priors at 10-km and 25-km scales; and (ii)</w:t>
       </w:r>
       <w:r>
         <w:t xml:space="preserve"> </w:t>
@@ -502,46 +526,56 @@
       </w:r>
       <m:oMath>
         <m:r>
-          <m:t>0.75</m:t>
-        </m:r>
-      </m:oMath>
-      <w:r>
-        <w:rPr>
-          <w:b/>
-          <w:bCs/>
-        </w:rPr>
-        <w:t xml:space="preserve"> </w:t>
-      </w:r>
-      <w:r>
-        <w:rPr>
-          <w:b/>
-          <w:bCs/>
-        </w:rPr>
-        <w:t xml:space="preserve">seconds</w:t>
-      </w:r>
-      <w:r>
-        <w:t xml:space="preserve"> </w:t>
-      </w:r>
-      <w:r>
-        <w:t xml:space="preserve">on standard consumer-grade ARM64 CPUs (</w:t>
-      </w:r>
-      <m:oMath>
-        <m:r>
-          <m:t>4</m:t>
+          <m:t>1.4</m:t>
         </m:r>
         <m:r>
           <m:rPr>
             <m:nor/>
             <m:sty m:val="p"/>
           </m:rPr>
-          <m:t> ms</m:t>
+          <m:t>–</m:t>
+        </m:r>
+        <m:r>
+          <m:t>1.8</m:t>
         </m:r>
       </m:oMath>
       <w:r>
-        <w:t xml:space="preserve"> </w:t>
-      </w:r>
-      <w:r>
-        <w:t xml:space="preserve">for vectorized array classification), demonstrating that sovereign early-warning systems do not require prohibitive cloud infrastructure.</w:t>
+        <w:rPr>
+          <w:b/>
+          <w:bCs/>
+        </w:rPr>
+        <w:t xml:space="preserve"> </w:t>
+      </w:r>
+      <w:r>
+        <w:rPr>
+          <w:b/>
+          <w:bCs/>
+        </w:rPr>
+        <w:t xml:space="preserve">seconds</w:t>
+      </w:r>
+      <w:r>
+        <w:t xml:space="preserve"> </w:t>
+      </w:r>
+      <w:r>
+        <w:t xml:space="preserve">on a standard ARM64 machine (~</w:t>
+      </w:r>
+      <m:oMath>
+        <m:r>
+          <m:t>2.0</m:t>
+        </m:r>
+        <m:r>
+          <m:rPr>
+            <m:nor/>
+            <m:sty m:val="p"/>
+          </m:rPr>
+          <m:t> GB</m:t>
+        </m:r>
+      </m:oMath>
+      <w:r>
+        <w:t xml:space="preserve"> </w:t>
+      </w:r>
+      <w:r>
+        <w:t xml:space="preserve">peak RAM), demonstrating that sovereign early-warning systems do not require prohibitive cloud infrastructure.</w:t>
       </w:r>
     </w:p>
     <w:p>
@@ -616,7 +650,7 @@
           <w:b/>
           <w:bCs/>
         </w:rPr>
-        <w:t xml:space="preserve">Rigorous Spatial Autocorrelation Control:</w:t>
+        <w:t xml:space="preserve">Spatial and Temporal Control:</w:t>
       </w:r>
       <w:r>
         <w:t xml:space="preserve"> </w:t>
@@ -632,40 +666,13 @@
           <w:b/>
           <w:bCs/>
         </w:rPr>
-        <w:t xml:space="preserve">20-km dead-zone spatial exclusion buffer</w:t>
-      </w:r>
-      <w:r>
-        <w:t xml:space="preserve"> </w:t>
-      </w:r>
-      <w:r>
-        <w:t xml:space="preserve">(derived from the empirical semivariogram range,</w:t>
-      </w:r>
-      <w:r>
-        <w:t xml:space="preserve"> </w:t>
-      </w:r>
-      <m:oMath>
-        <m:r>
-          <m:t>a</m:t>
-        </m:r>
-        <m:r>
-          <m:rPr>
-            <m:sty m:val="p"/>
-          </m:rPr>
-          <m:t>=</m:t>
-        </m:r>
-        <m:r>
-          <m:t>18.4</m:t>
-        </m:r>
-        <m:r>
-          <m:rPr>
-            <m:nor/>
-            <m:sty m:val="p"/>
-          </m:rPr>
-          <m:t> km</m:t>
-        </m:r>
-      </m:oMath>
-      <w:r>
-        <w:t xml:space="preserve">) and multi-year out-of-time test partitions (2024–2025), eliminating both spatial and temporal data leakage.</w:t>
+        <w:t xml:space="preserve">20-km dead-zone buffer for negative sampling</w:t>
+      </w:r>
+      <w:r>
+        <w:t xml:space="preserve"> </w:t>
+      </w:r>
+      <w:r>
+        <w:t xml:space="preserve">and multi-year out-of-time test partitions (2024–2025). The test is temporal; a spatial block holdout and a reproducible semivariogram remain pending. Priors are causal (monthly cutoff, rolling 3-year window).</w:t>
       </w:r>
     </w:p>
     <w:p>
@@ -751,7 +758,7 @@
         <w:rPr>
           <w:rStyle w:val="VerbatimChar"/>
         </w:rPr>
-        <w:t xml:space="preserve">scripts/15_...</w:t>
+        <w:t xml:space="preserve">scripts/17_...</w:t>
       </w:r>
       <w:r>
         <w:t xml:space="preserve">) under the permissive MIT License.</w:t>
@@ -808,20 +815,47 @@
         <w:t xml:space="preserve"> </w:t>
       </w:r>
       <w:r>
-        <w:t xml:space="preserve">holdout cell-days during the 2024–2025 extreme crisis, our biophysical ignition layer achieves a ROC-AUC of</w:t>
+        <w:t xml:space="preserve">holdout cell-days during the 2024–2025 extreme crisis, our hybrid ignition layer</w:t>
       </w:r>
       <w:r>
         <w:t xml:space="preserve"> </w:t>
       </w:r>
       <m:oMath>
-        <m:r>
-          <m:t>0.7219</m:t>
-        </m:r>
+        <m:sSub>
+          <m:e>
+            <m:r>
+              <m:rPr>
+                <m:scr m:val="script"/>
+                <m:sty m:val="p"/>
+              </m:rPr>
+              <m:t>M</m:t>
+            </m:r>
+          </m:e>
+          <m:sub>
+            <m:r>
+              <m:t>3</m:t>
+            </m:r>
+          </m:sub>
+        </m:sSub>
       </m:oMath>
       <w:r>
         <w:t xml:space="preserve"> </w:t>
       </w:r>
       <w:r>
+        <w:t xml:space="preserve">achieves a ROC-AUC of</w:t>
+      </w:r>
+      <w:r>
+        <w:t xml:space="preserve"> </w:t>
+      </w:r>
+      <m:oMath>
+        <m:r>
+          <m:t>0.7858</m:t>
+        </m:r>
+      </m:oMath>
+      <w:r>
+        <w:t xml:space="preserve"> </w:t>
+      </w:r>
+      <w:r>
         <w:t xml:space="preserve">in the Gran Chaco and</w:t>
       </w:r>
       <w:r>
@@ -829,14 +863,14 @@
       </w:r>
       <m:oMath>
         <m:r>
-          <m:t>0.7978</m:t>
+          <m:t>0.8277</m:t>
         </m:r>
       </m:oMath>
       <w:r>
         <w:t xml:space="preserve"> </w:t>
       </w:r>
       <w:r>
-        <w:t xml:space="preserve">in the Oriental Region (dramatically outperforming both the Canadian FWI at</w:t>
+        <w:t xml:space="preserve">in the Oriental Region, versus</w:t>
       </w:r>
       <w:r>
         <w:t xml:space="preserve"> </w:t>
@@ -847,12 +881,24 @@
         </m:r>
       </m:oMath>
       <w:r>
-        <w:t xml:space="preserve"> </w:t>
-      </w:r>
-      <w:r>
+        <w:rPr>
+          <w:b/>
+          <w:bCs/>
+        </w:rPr>
+        <w:t xml:space="preserve"> </w:t>
+      </w:r>
+      <w:r>
+        <w:rPr>
+          <w:b/>
+          <w:bCs/>
+        </w:rPr>
         <w:t xml:space="preserve">/</w:t>
       </w:r>
       <w:r>
+        <w:rPr>
+          <w:b/>
+          <w:bCs/>
+        </w:rPr>
         <w:t xml:space="preserve"> </w:t>
       </w:r>
       <m:oMath>
@@ -864,7 +910,7 @@
         <w:t xml:space="preserve"> </w:t>
       </w:r>
       <w:r>
-        <w:t xml:space="preserve">and INPE at</w:t>
+        <w:t xml:space="preserve">for the Canadian FWI (ISI) and</w:t>
       </w:r>
       <w:r>
         <w:t xml:space="preserve"> </w:t>
@@ -875,12 +921,24 @@
         </m:r>
       </m:oMath>
       <w:r>
-        <w:t xml:space="preserve"> </w:t>
-      </w:r>
-      <w:r>
+        <w:rPr>
+          <w:b/>
+          <w:bCs/>
+        </w:rPr>
+        <w:t xml:space="preserve"> </w:t>
+      </w:r>
+      <w:r>
+        <w:rPr>
+          <w:b/>
+          <w:bCs/>
+        </w:rPr>
         <w:t xml:space="preserve">/</w:t>
       </w:r>
       <w:r>
+        <w:rPr>
+          <w:b/>
+          <w:bCs/>
+        </w:rPr>
         <w:t xml:space="preserve"> </w:t>
       </w:r>
       <m:oMath>
@@ -889,28 +947,40 @@
         </m:r>
       </m:oMath>
       <w:r>
-        <w:t xml:space="preserve">), while tactical propagation achieves a ROC-AUC of</w:t>
+        <w:t xml:space="preserve"> </w:t>
+      </w:r>
+      <w:r>
+        <w:t xml:space="preserve">for the INPE proxy. Case-control</w:t>
       </w:r>
       <w:r>
         <w:t xml:space="preserve"> </w:t>
       </w:r>
       <m:oMath>
-        <m:r>
-          <m:t>0.8741</m:t>
-        </m:r>
+        <m:sSub>
+          <m:e>
+            <m:r>
+              <m:t>F</m:t>
+            </m:r>
+          </m:e>
+          <m:sub>
+            <m:r>
+              <m:t>0.5</m:t>
+            </m:r>
+          </m:sub>
+        </m:sSub>
       </m:oMath>
       <w:r>
         <w:t xml:space="preserve"> </w:t>
       </w:r>
       <w:r>
-        <w:t xml:space="preserve">and a precision of</w:t>
+        <w:t xml:space="preserve">precision is</w:t>
       </w:r>
       <w:r>
         <w:t xml:space="preserve"> </w:t>
       </w:r>
       <m:oMath>
         <m:r>
-          <m:t>86.73</m:t>
+          <m:t>38.16</m:t>
         </m:r>
         <m:r>
           <m:rPr>
@@ -924,36 +994,96 @@
         <w:t xml:space="preserve"> </w:t>
       </w:r>
       <w:r>
-        <w:t xml:space="preserve">with only 3,552 false positives across the entire holdout set (compared to</w:t>
+        <w:t xml:space="preserve">/</w:t>
       </w:r>
       <w:r>
         <w:t xml:space="preserve"> </w:t>
       </w:r>
       <m:oMath>
         <m:r>
+          <m:t>47.01</m:t>
+        </m:r>
+        <m:r>
           <m:rPr>
+            <m:nor/>
             <m:sty m:val="p"/>
           </m:rPr>
-          <m:t>&gt;</m:t>
-        </m:r>
-        <m:r>
-          <m:t>696</m:t>
+          <m:t> %</m:t>
+        </m:r>
+      </m:oMath>
+      <w:r>
+        <w:t xml:space="preserve">; after correction to population prevalence (~0.08 % / 0.19 %), operational precision is</w:t>
+      </w:r>
+      <w:r>
+        <w:t xml:space="preserve"> </w:t>
+      </w:r>
+      <m:oMath>
+        <m:r>
+          <m:t>0.74</m:t>
         </m:r>
         <m:r>
           <m:rPr>
+            <m:nor/>
             <m:sty m:val="p"/>
           </m:rPr>
-          <m:t>,</m:t>
-        </m:r>
-        <m:r>
-          <m:t>000</m:t>
+          <m:t> %</m:t>
         </m:r>
       </m:oMath>
       <w:r>
         <w:t xml:space="preserve"> </w:t>
       </w:r>
       <w:r>
-        <w:t xml:space="preserve">false alarms generated by the operational INPE proxy).</w:t>
+        <w:t xml:space="preserve">/</w:t>
+      </w:r>
+      <w:r>
+        <w:t xml:space="preserve"> </w:t>
+      </w:r>
+      <m:oMath>
+        <m:r>
+          <m:t>1.96</m:t>
+        </m:r>
+        <m:r>
+          <m:rPr>
+            <m:nor/>
+            <m:sty m:val="p"/>
+          </m:rPr>
+          <m:t> %</m:t>
+        </m:r>
+      </m:oMath>
+      <w:r>
+        <w:t xml:space="preserve">. Tactical propagation achieves ROC-AUC</w:t>
+      </w:r>
+      <w:r>
+        <w:t xml:space="preserve"> </w:t>
+      </w:r>
+      <m:oMath>
+        <m:r>
+          <m:t>0.9121</m:t>
+        </m:r>
+      </m:oMath>
+      <w:r>
+        <w:t xml:space="preserve"> </w:t>
+      </w:r>
+      <w:r>
+        <w:t xml:space="preserve">(Chaco) and population precision</w:t>
+      </w:r>
+      <w:r>
+        <w:t xml:space="preserve"> </w:t>
+      </w:r>
+      <m:oMath>
+        <m:r>
+          <m:t>11.87</m:t>
+        </m:r>
+        <m:r>
+          <m:rPr>
+            <m:nor/>
+            <m:sty m:val="p"/>
+          </m:rPr>
+          <m:t> %</m:t>
+        </m:r>
+      </m:oMath>
+      <w:r>
+        <w:t xml:space="preserve">. These corrected metrics are the honest operational benchmark.</w:t>
       </w:r>
     </w:p>
     <w:bookmarkEnd w:id="10"/>

</xml_diff>

<commit_message>
docs(render): regenerar HTML y DOCX con resultados D2
</commit_message>
<xml_diff>
--- a/cover_letter.docx
+++ b/cover_letter.docx
@@ -121,7 +121,7 @@
           <w:b/>
           <w:bCs/>
         </w:rPr>
-        <w:t xml:space="preserve">“Decoupling Biophysical Ignition Hazard and Tactical Wildfire Propagation in the Gran Chaco via Multiscale GeoAI (2018–2025): A Reproducible Two-Stage Computational Framework for Daily Hazard Nowcasting and International Benchmarking Against Canadian FWI and INPE”</w:t>
+        <w:t xml:space="preserve">“Decoupling Biophysical Ignition Hazard and Tactical Wildfire Propagation in the Gran Chaco via Multiscale GeoAI (2018–2025): A Reproducible Two-Stage Computational Framework for Daily Hazard Nowcasting and International Benchmarking Against Canadian FWI (ISI) and INPE proxy”</w:t>
       </w:r>
       <w:r>
         <w:t xml:space="preserve">, which we submit for consideration as a</w:t>
@@ -524,19 +524,16 @@
       <w:r>
         <w:t xml:space="preserve"> </w:t>
       </w:r>
+      <w:r>
+        <w:rPr>
+          <w:b/>
+          <w:bCs/>
+        </w:rPr>
+        <w:t xml:space="preserve">~</w:t>
+      </w:r>
       <m:oMath>
         <m:r>
           <m:t>1.4</m:t>
-        </m:r>
-        <m:r>
-          <m:rPr>
-            <m:nor/>
-            <m:sty m:val="p"/>
-          </m:rPr>
-          <m:t>–</m:t>
-        </m:r>
-        <m:r>
-          <m:t>1.8</m:t>
         </m:r>
       </m:oMath>
       <w:r>
@@ -704,7 +701,7 @@
           <w:b/>
           <w:bCs/>
         </w:rPr>
-        <w:t xml:space="preserve">40 unit tests</w:t>
+        <w:t xml:space="preserve">54 unit tests</w:t>
       </w:r>
       <w:r>
         <w:t xml:space="preserve"> </w:t>
@@ -732,14 +729,14 @@
           <m:t>≈</m:t>
         </m:r>
         <m:r>
-          <m:t>1.0</m:t>
+          <m:t>2.0</m:t>
         </m:r>
         <m:r>
           <m:rPr>
             <m:nor/>
             <m:sty m:val="p"/>
           </m:rPr>
-          <m:t> second</m:t>
+          <m:t> seconds</m:t>
         </m:r>
       </m:oMath>
       <w:r>
@@ -758,7 +755,7 @@
         <w:rPr>
           <w:rStyle w:val="VerbatimChar"/>
         </w:rPr>
-        <w:t xml:space="preserve">scripts/17_...</w:t>
+        <w:t xml:space="preserve">scripts/21_...</w:t>
       </w:r>
       <w:r>
         <w:t xml:space="preserve">) under the permissive MIT License.</w:t>
@@ -783,7 +780,7 @@
         <w:t xml:space="preserve"> </w:t>
       </w:r>
       <w:r>
-        <w:t xml:space="preserve">In prospective blind testing over</w:t>
+        <w:t xml:space="preserve">In retrospective temporal testing over</w:t>
       </w:r>
       <w:r>
         <w:t xml:space="preserve"> </w:t>
@@ -799,7 +796,7 @@
           <m:t>,</m:t>
         </m:r>
         <m:r>
-          <m:t>841</m:t>
+          <m:t>813</m:t>
         </m:r>
         <m:r>
           <m:rPr>
@@ -808,14 +805,14 @@
           <m:t>,</m:t>
         </m:r>
         <m:r>
-          <m:t>147</m:t>
+          <m:t>966</m:t>
         </m:r>
       </m:oMath>
       <w:r>
         <w:t xml:space="preserve"> </w:t>
       </w:r>
       <w:r>
-        <w:t xml:space="preserve">holdout cell-days during the 2024–2025 extreme crisis, our hybrid ignition layer</w:t>
+        <w:t xml:space="preserve">D2 holdout cell-days during 2024–2025, our hybrid ignition layer</w:t>
       </w:r>
       <w:r>
         <w:t xml:space="preserve"> </w:t>
@@ -849,7 +846,7 @@
       </w:r>
       <m:oMath>
         <m:r>
-          <m:t>0.7858</m:t>
+          <m:t>0.7852</m:t>
         </m:r>
       </m:oMath>
       <w:r>
@@ -863,7 +860,7 @@
       </w:r>
       <m:oMath>
         <m:r>
-          <m:t>0.8277</m:t>
+          <m:t>0.7480</m:t>
         </m:r>
       </m:oMath>
       <w:r>
@@ -877,7 +874,7 @@
       </w:r>
       <m:oMath>
         <m:r>
-          <m:t>0.5183</m:t>
+          <m:t>0.5177</m:t>
         </m:r>
       </m:oMath>
       <w:r>
@@ -903,7 +900,7 @@
       </w:r>
       <m:oMath>
         <m:r>
-          <m:t>0.6055</m:t>
+          <m:t>0.5605</m:t>
         </m:r>
       </m:oMath>
       <w:r>
@@ -917,7 +914,7 @@
       </w:r>
       <m:oMath>
         <m:r>
-          <m:t>0.5036</m:t>
+          <m:t>0.4997</m:t>
         </m:r>
       </m:oMath>
       <w:r>
@@ -943,7 +940,7 @@
       </w:r>
       <m:oMath>
         <m:r>
-          <m:t>0.5865</m:t>
+          <m:t>0.5274</m:t>
         </m:r>
       </m:oMath>
       <w:r>
@@ -980,7 +977,7 @@
       </w:r>
       <m:oMath>
         <m:r>
-          <m:t>38.16</m:t>
+          <m:t>27.52</m:t>
         </m:r>
         <m:r>
           <m:rPr>
@@ -1001,7 +998,7 @@
       </w:r>
       <m:oMath>
         <m:r>
-          <m:t>47.01</m:t>
+          <m:t>32.63</m:t>
         </m:r>
         <m:r>
           <m:rPr>
@@ -1012,14 +1009,14 @@
         </m:r>
       </m:oMath>
       <w:r>
-        <w:t xml:space="preserve">; after correction to population prevalence (~0.08 % / 0.19 %), operational precision is</w:t>
+        <w:t xml:space="preserve">; after correction to population prevalence (~0.015 % / 0.041 %), operational precision is</w:t>
       </w:r>
       <w:r>
         <w:t xml:space="preserve"> </w:t>
       </w:r>
       <m:oMath>
         <m:r>
-          <m:t>0.74</m:t>
+          <m:t>0.062</m:t>
         </m:r>
         <m:r>
           <m:rPr>
@@ -1040,7 +1037,7 @@
       </w:r>
       <m:oMath>
         <m:r>
-          <m:t>1.96</m:t>
+          <m:t>0.242</m:t>
         </m:r>
         <m:r>
           <m:rPr>
@@ -1058,7 +1055,7 @@
       </w:r>
       <m:oMath>
         <m:r>
-          <m:t>0.9121</m:t>
+          <m:t>0.8988</m:t>
         </m:r>
       </m:oMath>
       <w:r>
@@ -1072,7 +1069,7 @@
       </w:r>
       <m:oMath>
         <m:r>
-          <m:t>11.87</m:t>
+          <m:t>9.853</m:t>
         </m:r>
         <m:r>
           <m:rPr>
@@ -1117,7 +1114,7 @@
         </w:numPr>
       </w:pPr>
       <w:r>
-        <w:t xml:space="preserve">All source code, trained model boosters, synthetic validation data, and reproduction scripts are openly hosted on GitHub (</w:t>
+        <w:t xml:space="preserve">All source code and reproduction scripts are openly hosted on GitHub (</w:t>
       </w:r>
       <w:r>
         <w:rPr>
@@ -1126,7 +1123,22 @@
         <w:t xml:space="preserve">https://github.com/sanchezmartin093-code/Incendios_PY</w:t>
       </w:r>
       <w:r>
-        <w:t xml:space="preserve">) with a permanent archiving workflow on Zenodo.</w:t>
+        <w:t xml:space="preserve">). Processed data and trained models are documented with SHA-256 hashes in</w:t>
+      </w:r>
+      <w:r>
+        <w:t xml:space="preserve"> </w:t>
+      </w:r>
+      <w:r>
+        <w:rPr>
+          <w:rStyle w:val="VerbatimChar"/>
+        </w:rPr>
+        <w:t xml:space="preserve">fuentes/MANIFIESTO_DATOS_v2.csv</w:t>
+      </w:r>
+      <w:r>
+        <w:t xml:space="preserve"> </w:t>
+      </w:r>
+      <w:r>
+        <w:t xml:space="preserve">and archived on Zenodo/OSF.</w:t>
       </w:r>
     </w:p>
     <w:p>

</xml_diff>

<commit_message>
feat(benchmark): FWI completo, INPE v11, cost-loss y benchmark computacional
</commit_message>
<xml_diff>
--- a/cover_letter.docx
+++ b/cover_letter.docx
@@ -121,7 +121,7 @@
           <w:b/>
           <w:bCs/>
         </w:rPr>
-        <w:t xml:space="preserve">“Decoupling Biophysical Ignition Hazard and Tactical Wildfire Propagation in the Gran Chaco via Multiscale GeoAI (2018–2025): A Reproducible Two-Stage Computational Framework for Daily Hazard Nowcasting and International Benchmarking Against Canadian FWI (ISI) and INPE proxy”</w:t>
+        <w:t xml:space="preserve">“Decoupling Biophysical Ignition Hazard and Tactical Wildfire Propagation in the Gran Chaco via Multiscale GeoAI (2018–2025): A Reproducible Two-Stage Computational Framework for Daily Hazard Nowcasting and International Benchmarking Against full Canadian FWI and INPE”</w:t>
       </w:r>
       <w:r>
         <w:t xml:space="preserve">, which we submit for consideration as a</w:t>
@@ -533,7 +533,7 @@
       </w:r>
       <m:oMath>
         <m:r>
-          <m:t>1.4</m:t>
+          <m:t>1.57</m:t>
         </m:r>
       </m:oMath>
       <w:r>
@@ -558,7 +558,7 @@
       </w:r>
       <m:oMath>
         <m:r>
-          <m:t>2.0</m:t>
+          <m:t>2.18</m:t>
         </m:r>
         <m:r>
           <m:rPr>
@@ -846,7 +846,7 @@
       </w:r>
       <m:oMath>
         <m:r>
-          <m:t>0.7852</m:t>
+          <m:t>0.7851</m:t>
         </m:r>
       </m:oMath>
       <w:r>
@@ -860,7 +860,7 @@
       </w:r>
       <m:oMath>
         <m:r>
-          <m:t>0.7480</m:t>
+          <m:t>0.7485</m:t>
         </m:r>
       </m:oMath>
       <w:r>
@@ -874,7 +874,7 @@
       </w:r>
       <m:oMath>
         <m:r>
-          <m:t>0.5177</m:t>
+          <m:t>0.5185</m:t>
         </m:r>
       </m:oMath>
       <w:r>
@@ -900,21 +900,21 @@
       </w:r>
       <m:oMath>
         <m:r>
-          <m:t>0.5605</m:t>
+          <m:t>0.5569</m:t>
         </m:r>
       </m:oMath>
       <w:r>
         <w:t xml:space="preserve"> </w:t>
       </w:r>
       <w:r>
-        <w:t xml:space="preserve">for the Canadian FWI (ISI) and</w:t>
+        <w:t xml:space="preserve">for the full Canadian FWI and</w:t>
       </w:r>
       <w:r>
         <w:t xml:space="preserve"> </w:t>
       </w:r>
       <m:oMath>
         <m:r>
-          <m:t>0.4997</m:t>
+          <m:t>0.5386</m:t>
         </m:r>
       </m:oMath>
       <w:r>
@@ -940,14 +940,14 @@
       </w:r>
       <m:oMath>
         <m:r>
-          <m:t>0.5274</m:t>
+          <m:t>0.4994</m:t>
         </m:r>
       </m:oMath>
       <w:r>
         <w:t xml:space="preserve"> </w:t>
       </w:r>
       <w:r>
-        <w:t xml:space="preserve">for the INPE proxy. Case-control</w:t>
+        <w:t xml:space="preserve">for the INPE. Case-control</w:t>
       </w:r>
       <w:r>
         <w:t xml:space="preserve"> </w:t>
@@ -977,7 +977,7 @@
       </w:r>
       <m:oMath>
         <m:r>
-          <m:t>27.52</m:t>
+          <m:t>27.54</m:t>
         </m:r>
         <m:r>
           <m:rPr>
@@ -998,7 +998,7 @@
       </w:r>
       <m:oMath>
         <m:r>
-          <m:t>32.63</m:t>
+          <m:t>29.67</m:t>
         </m:r>
         <m:r>
           <m:rPr>
@@ -1037,7 +1037,7 @@
       </w:r>
       <m:oMath>
         <m:r>
-          <m:t>0.242</m:t>
+          <m:t>0.206</m:t>
         </m:r>
         <m:r>
           <m:rPr>

</xml_diff>

<commit_message>
feat(metrics): bootstrap por bloques, modelos deterministas y resultados consistentes
</commit_message>
<xml_diff>
--- a/cover_letter.docx
+++ b/cover_letter.docx
@@ -1055,7 +1055,7 @@
       </w:r>
       <m:oMath>
         <m:r>
-          <m:t>0.8988</m:t>
+          <m:t>0.8989</m:t>
         </m:r>
       </m:oMath>
       <w:r>
@@ -1069,7 +1069,7 @@
       </w:r>
       <m:oMath>
         <m:r>
-          <m:t>9.853</m:t>
+          <m:t>9.96</m:t>
         </m:r>
         <m:r>
           <m:rPr>

</xml_diff>

<commit_message>
fix(manuscrito): sincroniza metricas, highlights y validacion espacial
</commit_message>
<xml_diff>
--- a/cover_letter.docx
+++ b/cover_letter.docx
@@ -653,23 +653,36 @@
         <w:t xml:space="preserve"> </w:t>
       </w:r>
       <w:r>
-        <w:t xml:space="preserve">We implement a</w:t>
-      </w:r>
-      <w:r>
-        <w:t xml:space="preserve"> </w:t>
-      </w:r>
-      <w:r>
-        <w:rPr>
-          <w:b/>
-          <w:bCs/>
-        </w:rPr>
-        <w:t xml:space="preserve">20-km dead-zone buffer for negative sampling</w:t>
-      </w:r>
-      <w:r>
-        <w:t xml:space="preserve"> </w:t>
-      </w:r>
-      <w:r>
-        <w:t xml:space="preserve">and multi-year out-of-time test partitions (2024–2025). The test is temporal; a spatial block holdout and a reproducible semivariogram remain pending. Priors are causal (monthly cutoff, rolling 3-year window).</w:t>
+        <w:t xml:space="preserve">We use the</w:t>
+      </w:r>
+      <w:r>
+        <w:t xml:space="preserve"> </w:t>
+      </w:r>
+      <w:r>
+        <w:rPr>
+          <w:b/>
+          <w:bCs/>
+        </w:rPr>
+        <w:t xml:space="preserve">D2 target definition</w:t>
+      </w:r>
+      <w:r>
+        <w:t xml:space="preserve"> </w:t>
+      </w:r>
+      <w:r>
+        <w:t xml:space="preserve">(no t-1 fire within 25 km; no same-cell fire in 10 days) and multi-year out-of-time test partitions (2024–2025). We also implement a</w:t>
+      </w:r>
+      <w:r>
+        <w:t xml:space="preserve"> </w:t>
+      </w:r>
+      <w:r>
+        <w:rPr>
+          <w:b/>
+          <w:bCs/>
+        </w:rPr>
+        <w:t xml:space="preserve">50-km spatial block holdout with a 20-km buffer</w:t>
+      </w:r>
+      <w:r>
+        <w:t xml:space="preserve">; a reproducible semivariogram remains pending. Priors are causal (monthly cutoff, rolling 3-year window).</w:t>
       </w:r>
     </w:p>
     <w:p>
@@ -701,7 +714,7 @@
           <w:b/>
           <w:bCs/>
         </w:rPr>
-        <w:t xml:space="preserve">54 unit tests</w:t>
+        <w:t xml:space="preserve">62 unit tests</w:t>
       </w:r>
       <w:r>
         <w:t xml:space="preserve"> </w:t>
@@ -729,7 +742,7 @@
           <m:t>≈</m:t>
         </m:r>
         <m:r>
-          <m:t>2.0</m:t>
+          <m:t>1.7</m:t>
         </m:r>
         <m:r>
           <m:rPr>
@@ -755,7 +768,7 @@
         <w:rPr>
           <w:rStyle w:val="VerbatimChar"/>
         </w:rPr>
-        <w:t xml:space="preserve">scripts/21_...</w:t>
+        <w:t xml:space="preserve">scripts/24_...</w:t>
       </w:r>
       <w:r>
         <w:t xml:space="preserve">) under the permissive MIT License.</w:t>

</xml_diff>

<commit_message>
feat(framing): reposiciona manuscrito como marco computacional reproducible
</commit_message>
<xml_diff>
--- a/cover_letter.docx
+++ b/cover_letter.docx
@@ -95,7 +95,7 @@
           <w:i/>
           <w:iCs/>
         </w:rPr>
-        <w:t xml:space="preserve">“Decoupling Biophysical Ignition Hazard and Tactical Wildfire Propagation in the Gran Chaco via Multiscale GeoAI (2018–2025)”</w:t>
+        <w:t xml:space="preserve">“A Reproducible Computational Framework for Decoupled Wildfire Ignition and Propagation Benchmarking in the Gran Chaco (2018–2025)”</w:t>
       </w:r>
     </w:p>
     <w:p>
@@ -121,7 +121,7 @@
           <w:b/>
           <w:bCs/>
         </w:rPr>
-        <w:t xml:space="preserve">“Decoupling Biophysical Ignition Hazard and Tactical Wildfire Propagation in the Gran Chaco via Multiscale GeoAI (2018–2025): A Reproducible Two-Stage Computational Framework for Daily Hazard Nowcasting and International Benchmarking Against full Canadian FWI and INPE”</w:t>
+        <w:t xml:space="preserve">“A Reproducible Computational Framework for Decoupled Wildfire Ignition and Propagation Benchmarking in the Gran Chaco (2018–2025): D2 Targets, Gated M3/M1 Inference and an Open Benchmark Against Canadian FWI and INPE”</w:t>
       </w:r>
       <w:r>
         <w:t xml:space="preserve">, which we submit for consideration as a</w:t>
@@ -246,7 +246,7 @@
         <w:pStyle w:val="BodyText"/>
       </w:pPr>
       <w:r>
-        <w:t xml:space="preserve">To solve these challenges, we introduce</w:t>
+        <w:t xml:space="preserve">To address these challenges, we introduce</w:t>
       </w:r>
       <w:r>
         <w:t xml:space="preserve"> </w:t>
@@ -258,7 +258,7 @@
         <w:t xml:space="preserve">Incendios_PY</w:t>
       </w:r>
       <w:r>
-        <w:t xml:space="preserve">, an open-source, decoupled computational GeoAI framework operating across</w:t>
+        <w:t xml:space="preserve">, an open-source computational framework for reproducible decoupled wildfire modelling across</w:t>
       </w:r>
       <w:r>
         <w:t xml:space="preserve"> </w:t>
@@ -277,20 +277,6 @@
           <m:t>006</m:t>
         </m:r>
       </m:oMath>
-      <w:r>
-        <w:rPr>
-          <w:b/>
-          <w:bCs/>
-        </w:rPr>
-        <w:t xml:space="preserve"> </w:t>
-      </w:r>
-      <w:r>
-        <w:rPr>
-          <w:b/>
-          <w:bCs/>
-        </w:rPr>
-        <w:t xml:space="preserve">sovereign</w:t>
-      </w:r>
       <w:r>
         <w:rPr>
           <w:b/>
@@ -464,7 +450,7 @@
         <w:t xml:space="preserve">Earth and Planetary Sciences</w:t>
       </w:r>
       <w:r>
-        <w:t xml:space="preserve">:</w:t>
+        <w:t xml:space="preserve">. The contribution is a reusable protocol and benchmark, not a new boosting algorithm: D2 target construction, gated M3/M1 inference, and a reproducible evaluation harness are the computational core.</w:t>
       </w:r>
     </w:p>
     <w:p>
@@ -572,7 +558,7 @@
         <w:t xml:space="preserve"> </w:t>
       </w:r>
       <w:r>
-        <w:t xml:space="preserve">peak RAM), demonstrating that sovereign early-warning systems do not require prohibitive cloud infrastructure.</w:t>
+        <w:t xml:space="preserve">peak RAM), demonstrating that national early-warning systems do not require prohibitive cloud infrastructure.</w:t>
       </w:r>
     </w:p>
     <w:p>

</xml_diff>

<commit_message>
docs(release): actualiza DOI, manifiesto v3 y PDFs finales
</commit_message>
<xml_diff>
--- a/cover_letter.docx
+++ b/cover_letter.docx
@@ -15,7 +15,7 @@
         <w:pStyle w:val="Date"/>
       </w:pPr>
       <w:r>
-        <w:t xml:space="preserve">2026-10-25</w:t>
+        <w:t xml:space="preserve">2026-10-27</w:t>
       </w:r>
     </w:p>
     <w:p>
@@ -33,7 +33,7 @@
         <w:t xml:space="preserve"> </w:t>
       </w:r>
       <w:r>
-        <w:t xml:space="preserve">October 25, 2026</w:t>
+        <w:t xml:space="preserve">October 27, 2026</w:t>
       </w:r>
     </w:p>
     <w:p>
@@ -121,7 +121,7 @@
           <w:b/>
           <w:bCs/>
         </w:rPr>
-        <w:t xml:space="preserve">“A Reproducible Computational Framework for Decoupled Wildfire Ignition and Propagation Benchmarking in the Gran Chaco (2018–2025): D2 Targets, Gated M3/M1 Inference and an Open Benchmark Against Canadian FWI and INPE”</w:t>
+        <w:t xml:space="preserve">“A Reproducible Computational Framework for Decoupled Wildfire Ignition and Propagation Benchmarking in the Gran Chaco (2018–2025): D2 Targets, M3/M2 Inference and an Open Benchmark Against Canadian FWI and INPE”</w:t>
       </w:r>
       <w:r>
         <w:t xml:space="preserve">, which we submit for consideration as a</w:t>
@@ -450,7 +450,7 @@
         <w:t xml:space="preserve">Earth and Planetary Sciences</w:t>
       </w:r>
       <w:r>
-        <w:t xml:space="preserve">. The contribution is a reusable protocol and benchmark, not a new boosting algorithm: D2 target construction, gated M3/M1 inference, and a reproducible evaluation harness are the computational core.</w:t>
+        <w:t xml:space="preserve">. The contribution is a reusable protocol and benchmark, not a new boosting algorithm: D2 target construction, M3/M2 inference, and a reproducible evaluation harness are the computational core.</w:t>
       </w:r>
     </w:p>
     <w:p>
@@ -700,7 +700,7 @@
           <w:b/>
           <w:bCs/>
         </w:rPr>
-        <w:t xml:space="preserve">62 unit tests</w:t>
+        <w:t xml:space="preserve">76 unit tests</w:t>
       </w:r>
       <w:r>
         <w:t xml:space="preserve"> </w:t>
@@ -728,14 +728,14 @@
           <m:t>≈</m:t>
         </m:r>
         <m:r>
-          <m:t>1.7</m:t>
+          <m:t>1</m:t>
         </m:r>
         <m:r>
           <m:rPr>
             <m:nor/>
             <m:sty m:val="p"/>
           </m:rPr>
-          <m:t> seconds</m:t>
+          <m:t> minute</m:t>
         </m:r>
       </m:oMath>
       <w:r>
@@ -811,7 +811,7 @@
         <w:t xml:space="preserve"> </w:t>
       </w:r>
       <w:r>
-        <w:t xml:space="preserve">D2 holdout cell-days during 2024–2025, our hybrid ignition layer</w:t>
+        <w:t xml:space="preserve">D2 cell-days during 2024–2025, our hybrid ignition layer</w:t>
       </w:r>
       <w:r>
         <w:t xml:space="preserve"> </w:t>
@@ -845,7 +845,7 @@
       </w:r>
       <m:oMath>
         <m:r>
-          <m:t>0.7851</m:t>
+          <m:t>0.8021</m:t>
         </m:r>
       </m:oMath>
       <w:r>
@@ -859,7 +859,7 @@
       </w:r>
       <m:oMath>
         <m:r>
-          <m:t>0.7485</m:t>
+          <m:t>0.7534</m:t>
         </m:r>
       </m:oMath>
       <w:r>
@@ -873,7 +873,7 @@
       </w:r>
       <m:oMath>
         <m:r>
-          <m:t>0.5185</m:t>
+          <m:t>0.5173</m:t>
         </m:r>
       </m:oMath>
       <w:r>
@@ -899,7 +899,7 @@
       </w:r>
       <m:oMath>
         <m:r>
-          <m:t>0.5569</m:t>
+          <m:t>0.5564</m:t>
         </m:r>
       </m:oMath>
       <w:r>
@@ -913,7 +913,7 @@
       </w:r>
       <m:oMath>
         <m:r>
-          <m:t>0.5386</m:t>
+          <m:t>0.5389</m:t>
         </m:r>
       </m:oMath>
       <w:r>
@@ -939,7 +939,7 @@
       </w:r>
       <m:oMath>
         <m:r>
-          <m:t>0.4994</m:t>
+          <m:t>0.4990</m:t>
         </m:r>
       </m:oMath>
       <w:r>
@@ -976,7 +976,7 @@
       </w:r>
       <m:oMath>
         <m:r>
-          <m:t>27.54</m:t>
+          <m:t>32.82</m:t>
         </m:r>
         <m:r>
           <m:rPr>
@@ -997,7 +997,7 @@
       </w:r>
       <m:oMath>
         <m:r>
-          <m:t>29.67</m:t>
+          <m:t>30.13</m:t>
         </m:r>
         <m:r>
           <m:rPr>
@@ -1015,7 +1015,7 @@
       </w:r>
       <m:oMath>
         <m:r>
-          <m:t>0.062</m:t>
+          <m:t>0.082</m:t>
         </m:r>
         <m:r>
           <m:rPr>
@@ -1036,7 +1036,7 @@
       </w:r>
       <m:oMath>
         <m:r>
-          <m:t>0.206</m:t>
+          <m:t>0.198</m:t>
         </m:r>
         <m:r>
           <m:rPr>
@@ -1054,7 +1054,7 @@
       </w:r>
       <m:oMath>
         <m:r>
-          <m:t>0.8989</m:t>
+          <m:t>0.9039</m:t>
         </m:r>
       </m:oMath>
       <w:r>
@@ -1068,7 +1068,7 @@
       </w:r>
       <m:oMath>
         <m:r>
-          <m:t>9.96</m:t>
+          <m:t>9.67</m:t>
         </m:r>
         <m:r>
           <m:rPr>
@@ -1079,7 +1079,7 @@
         </m:r>
       </m:oMath>
       <w:r>
-        <w:t xml:space="preserve">. These corrected metrics are the honest operational benchmark.</w:t>
+        <w:t xml:space="preserve">. The 2023 validation selected M3 for temporal nowcasting and M2 as the operational fallback; M1 was rejected as a fallback. These corrected metrics are the honest operational benchmark.</w:t>
       </w:r>
     </w:p>
     <w:bookmarkEnd w:id="10"/>
@@ -1131,13 +1131,13 @@
         <w:rPr>
           <w:rStyle w:val="VerbatimChar"/>
         </w:rPr>
-        <w:t xml:space="preserve">fuentes/MANIFIESTO_DATOS_v2.csv</w:t>
-      </w:r>
-      <w:r>
-        <w:t xml:space="preserve"> </w:t>
-      </w:r>
-      <w:r>
-        <w:t xml:space="preserve">and archived on Zenodo (code DOI: 10.5281/zenodo.23675105; data DOI: 10.5281/zenodo.23675279).</w:t>
+        <w:t xml:space="preserve">fuentes/MANIFIESTO_DATOS_v3.csv</w:t>
+      </w:r>
+      <w:r>
+        <w:t xml:space="preserve"> </w:t>
+      </w:r>
+      <w:r>
+        <w:t xml:space="preserve">and archived on Zenodo (code concept DOI: 10.5281/zenodo.23675104; data concept DOI: 10.5281/zenodo.23675278; release v2.0.0).</w:t>
       </w:r>
     </w:p>
     <w:p>

</xml_diff>

<commit_message>
docs(release): enmarca la novedad computacional y publica disponibilidad v2.0.0
</commit_message>
<xml_diff>
--- a/cover_letter.docx
+++ b/cover_letter.docx
@@ -323,7 +323,7 @@
         <w:t xml:space="preserve"> </w:t>
       </w:r>
       <w:r>
-        <w:t xml:space="preserve">over an 8-year homogeneous multi-annual observation baseline (2018–2025). This horizon is strictly anchored to the dual-sensor VIIRS 375m constellation (Suomi-NPP and NOAA-20 in continuous orbital tandem), systematically eliminating observational effort bias and ensuring uniform temporal sampling across all modeling phases. We analytically decouple the operational task into two distinct models: (i)</w:t>
+        <w:t xml:space="preserve">over an 8-year multi-annual observation baseline (2018–2025). This horizon is anchored to the multi-sensor VIIRS 375 m constellation (Suomi-NPP, NOAA-20 and NOAA-21), which reduces single-sensor sampling bias across the modeling phases. We analytically decouple the operational task into two distinct models: (i)</w:t>
       </w:r>
       <w:r>
         <w:t xml:space="preserve"> </w:t>
@@ -450,7 +450,7 @@
         <w:t xml:space="preserve">Earth and Planetary Sciences</w:t>
       </w:r>
       <w:r>
-        <w:t xml:space="preserve">. The contribution is a reusable protocol and benchmark, not a new boosting algorithm: D2 target construction, M3/M2 inference, and a reproducible evaluation harness are the computational core.</w:t>
+        <w:t xml:space="preserve">. The computational contribution is the D2 target operator, the gated M3/M2 inference policy and a reusable evaluation harness, released as documented software. The learner is replaceable; the novelty lies in the computational contract.</w:t>
       </w:r>
     </w:p>
     <w:p>
@@ -668,7 +668,7 @@
         <w:t xml:space="preserve">50-km spatial block holdout with a 20-km buffer</w:t>
       </w:r>
       <w:r>
-        <w:t xml:space="preserve">; a reproducible semivariogram remains pending. Priors are causal (monthly cutoff, rolling 3-year window).</w:t>
+        <w:t xml:space="preserve">. Priors are causal (monthly cutoff, rolling 3-year window).</w:t>
       </w:r>
     </w:p>
     <w:p>
@@ -748,13 +748,13 @@
         <w:t xml:space="preserve">scripts/00_...</w:t>
       </w:r>
       <w:r>
-        <w:t xml:space="preserve">) to publication-ready outputs (</w:t>
+        <w:t xml:space="preserve">) to release and validation outputs (</w:t>
       </w:r>
       <w:r>
         <w:rPr>
           <w:rStyle w:val="VerbatimChar"/>
         </w:rPr>
-        <w:t xml:space="preserve">scripts/24_...</w:t>
+        <w:t xml:space="preserve">scripts/34_...</w:t>
       </w:r>
       <w:r>
         <w:t xml:space="preserve">) under the permissive MIT License.</w:t>
@@ -1134,10 +1134,7 @@
         <w:t xml:space="preserve">fuentes/MANIFIESTO_DATOS_v3.csv</w:t>
       </w:r>
       <w:r>
-        <w:t xml:space="preserve"> </w:t>
-      </w:r>
-      <w:r>
-        <w:t xml:space="preserve">and archived on Zenodo (code concept DOI: 10.5281/zenodo.23675104; data concept DOI: 10.5281/zenodo.23675278; release v2.0.0).</w:t>
+        <w:t xml:space="preserve">, available in the v2.0.0 GitHub release, and indexed by the code and data concept DOIs (10.5281/zenodo.23675104; 10.5281/zenodo.23675278).</w:t>
       </w:r>
     </w:p>
     <w:p>

</xml_diff>

<commit_message>
build(paper): sincroniza cover letter de la raiz con entregables
</commit_message>
<xml_diff>
--- a/cover_letter.docx
+++ b/cover_letter.docx
@@ -33,7 +33,7 @@
         <w:t xml:space="preserve"> </w:t>
       </w:r>
       <w:r>
-        <w:t xml:space="preserve">October 27, 2026</w:t>
+        <w:t xml:space="preserve">October 28, 2026</w:t>
       </w:r>
     </w:p>
     <w:p>
@@ -224,21 +224,7 @@
         <w:t xml:space="preserve"> </w:t>
       </w:r>
       <w:r>
-        <w:t xml:space="preserve">Widely deployed operational frameworks—such as the Canadian Forest Fire Weather Index (FWI) used by EFFIS/GWIS and the CPTEC/INPE Risco de Fogo—consistently fail or invert hazard rankings in water-limited subtropical biomes (e.g., the South American Gran Chaco), where vapor pressure deficit (</w:t>
-      </w:r>
-      <m:oMath>
-        <m:r>
-          <m:t>V</m:t>
-        </m:r>
-        <m:r>
-          <m:t>P</m:t>
-        </m:r>
-        <m:r>
-          <m:t>D</m:t>
-        </m:r>
-      </m:oMath>
-      <w:r>
-        <w:t xml:space="preserve">) and non-linear fuel-curing dynamics govern fire risk.</w:t>
+        <w:t xml:space="preserve">Widely deployed operational frameworks—such as the Canadian Forest Fire Weather Index (FWI) used by EFFIS/GWIS and the CPTEC/INPE Risco de Fogo—consistently fail or invert hazard rankings in water-limited subtropical biomes (e.g., the South American Gran Chaco), where vapor pressure deficit (VPD) and non-linear fuel-curing dynamics govern fire risk.</w:t>
       </w:r>
     </w:p>
     <w:p>
@@ -258,66 +244,17 @@
         <w:t xml:space="preserve">Incendios_PY</w:t>
       </w:r>
       <w:r>
-        <w:t xml:space="preserve">, an open-source computational framework for reproducible decoupled wildfire modelling across</w:t>
-      </w:r>
-      <w:r>
-        <w:t xml:space="preserve"> </w:t>
-      </w:r>
-      <m:oMath>
-        <m:r>
-          <m:t>400</m:t>
-        </m:r>
-        <m:r>
-          <m:rPr>
-            <m:sty m:val="p"/>
-          </m:rPr>
-          <m:t>,</m:t>
-        </m:r>
-        <m:r>
-          <m:t>006</m:t>
-        </m:r>
-      </m:oMath>
-      <w:r>
-        <w:rPr>
-          <w:b/>
-          <w:bCs/>
-        </w:rPr>
-        <w:t xml:space="preserve"> </w:t>
-      </w:r>
-      <m:oMath>
-        <m:r>
-          <m:t>1</m:t>
-        </m:r>
-        <m:sSup>
-          <m:e>
-            <m:r>
-              <m:rPr>
-                <m:nor/>
-                <m:sty m:val="p"/>
-              </m:rPr>
-              <m:t>-km</m:t>
-            </m:r>
-          </m:e>
-          <m:sup>
-            <m:r>
-              <m:t>2</m:t>
-            </m:r>
-          </m:sup>
-        </m:sSup>
-      </m:oMath>
-      <w:r>
-        <w:rPr>
-          <w:b/>
-          <w:bCs/>
-        </w:rPr>
-        <w:t xml:space="preserve"> </w:t>
-      </w:r>
-      <w:r>
-        <w:rPr>
-          <w:b/>
-          <w:bCs/>
-        </w:rPr>
-        <w:t xml:space="preserve">grid cells</w:t>
+        <w:t xml:space="preserve">, an open-source computational framework for reproducible decoupled wildfire modeling across</w:t>
+      </w:r>
+      <w:r>
+        <w:t xml:space="preserve"> </w:t>
+      </w:r>
+      <w:r>
+        <w:rPr>
+          <w:b/>
+          <w:bCs/>
+        </w:rPr>
+        <w:t xml:space="preserve">400 006 1-km² grid cells</w:t>
       </w:r>
       <w:r>
         <w:t xml:space="preserve"> </w:t>
@@ -339,28 +276,7 @@
         <w:t xml:space="preserve"> </w:t>
       </w:r>
       <w:r>
-        <w:t xml:space="preserve">(</w:t>
-      </w:r>
-      <m:oMath>
-        <m:sSub>
-          <m:e>
-            <m:r>
-              <m:rPr>
-                <m:scr m:val="script"/>
-                <m:sty m:val="p"/>
-              </m:rPr>
-              <m:t>M</m:t>
-            </m:r>
-          </m:e>
-          <m:sub>
-            <m:r>
-              <m:t>3</m:t>
-            </m:r>
-          </m:sub>
-        </m:sSub>
-      </m:oMath>
-      <w:r>
-        <w:t xml:space="preserve">), guided by physics-based monotonic constraints, ecotone edge gradients, and static anthropogenic priors at 10-km and 25-km scales; and (ii)</w:t>
+        <w:t xml:space="preserve">(M3), guided by physics-based monotonic constraints, ecotone edge gradients, and static anthropogenic priors at 10-km and 25-km scales; and (ii)</w:t>
       </w:r>
       <w:r>
         <w:t xml:space="preserve"> </w:t>
@@ -373,27 +289,7 @@
         <w:t xml:space="preserve">Tactical Propagation</w:t>
       </w:r>
       <w:r>
-        <w:t xml:space="preserve">, driven by a causal spatial contagion kernel at lag</w:t>
-      </w:r>
-      <w:r>
-        <w:t xml:space="preserve"> </w:t>
-      </w:r>
-      <m:oMath>
-        <m:r>
-          <m:t>t</m:t>
-        </m:r>
-        <m:r>
-          <m:rPr>
-            <m:sty m:val="p"/>
-          </m:rPr>
-          <m:t>−</m:t>
-        </m:r>
-        <m:r>
-          <m:t>1</m:t>
-        </m:r>
-      </m:oMath>
-      <w:r>
-        <w:t xml:space="preserve">.</w:t>
+        <w:t xml:space="preserve">, driven by a causal spatial contagion kernel at lag t−1.</w:t>
       </w:r>
     </w:p>
     <w:bookmarkEnd w:id="9"/>
@@ -472,93 +368,23 @@
         <w:t xml:space="preserve"> </w:t>
       </w:r>
       <w:r>
-        <w:t xml:space="preserve">By integrating Apache Arrow, DuckDB, and Polars, our inference engine processes the entire national territory (</w:t>
-      </w:r>
-      <m:oMath>
-        <m:r>
-          <m:t>400</m:t>
-        </m:r>
-        <m:r>
-          <m:rPr>
-            <m:sty m:val="p"/>
-          </m:rPr>
-          <m:t>,</m:t>
-        </m:r>
-        <m:r>
-          <m:t>006</m:t>
-        </m:r>
-        <m:sSup>
-          <m:e>
-            <m:r>
-              <m:rPr>
-                <m:nor/>
-                <m:sty m:val="p"/>
-              </m:rPr>
-              <m:t> km</m:t>
-            </m:r>
-          </m:e>
-          <m:sup>
-            <m:r>
-              <m:t>2</m:t>
-            </m:r>
-          </m:sup>
-        </m:sSup>
-      </m:oMath>
-      <w:r>
-        <w:t xml:space="preserve">) in</w:t>
-      </w:r>
-      <w:r>
-        <w:t xml:space="preserve"> </w:t>
-      </w:r>
-      <w:r>
-        <w:rPr>
-          <w:b/>
-          <w:bCs/>
-        </w:rPr>
-        <w:t xml:space="preserve">~</w:t>
-      </w:r>
-      <m:oMath>
-        <m:r>
-          <m:t>3.47</m:t>
-        </m:r>
-      </m:oMath>
-      <w:r>
-        <w:rPr>
-          <w:b/>
-          <w:bCs/>
-        </w:rPr>
-        <w:t xml:space="preserve"> </w:t>
-      </w:r>
-      <w:r>
-        <w:rPr>
-          <w:b/>
-          <w:bCs/>
-        </w:rPr>
-        <w:t xml:space="preserve">seconds</w:t>
-      </w:r>
-      <w:r>
-        <w:t xml:space="preserve"> </w:t>
-      </w:r>
-      <w:r>
-        <w:t xml:space="preserve">on a standard ARM64 machine (~</w:t>
-      </w:r>
-      <m:oMath>
-        <m:r>
-          <m:t>2.21</m:t>
-        </m:r>
-        <m:r>
-          <m:rPr>
-            <m:nor/>
-            <m:sty m:val="p"/>
-          </m:rPr>
-          <m:t> GB</m:t>
-        </m:r>
-      </m:oMath>
-      <w:r>
-        <w:t xml:space="preserve"> </w:t>
-      </w:r>
-      <w:r>
-        <w:t xml:space="preserve">peak RAM), demonstrating that national early-warning systems do not require prohibitive cloud infrastructure.</w:t>
+        <w:t xml:space="preserve">By integrating Apache Arrow, DuckDB, and Polars, our inference engine processes the entire national territory (400 006 km²) in</w:t>
+      </w:r>
+      <w:r>
+        <w:t xml:space="preserve"> </w:t>
+      </w:r>
+      <w:r>
+        <w:rPr>
+          <w:b/>
+          <w:bCs/>
+        </w:rPr>
+        <w:t xml:space="preserve">~3.47 seconds</w:t>
+      </w:r>
+      <w:r>
+        <w:t xml:space="preserve"> </w:t>
+      </w:r>
+      <w:r>
+        <w:t xml:space="preserve">on a standard ARM64 machine (~2.21 GB peak RAM), demonstrating that national early-warning systems do not require prohibitive cloud infrastructure.</w:t>
       </w:r>
     </w:p>
     <w:p>
@@ -580,44 +406,7 @@
         <w:t xml:space="preserve"> </w:t>
       </w:r>
       <w:r>
-        <w:t xml:space="preserve">We enforce structural monotonic constraints within LightGBM (</w:t>
-      </w:r>
-      <m:oMath>
-        <m:r>
-          <m:rPr>
-            <m:sty m:val="p"/>
-          </m:rPr>
-          <m:t>+</m:t>
-        </m:r>
-        <m:r>
-          <m:t>1</m:t>
-        </m:r>
-      </m:oMath>
-      <w:r>
-        <w:t xml:space="preserve"> </w:t>
-      </w:r>
-      <w:r>
-        <w:t xml:space="preserve">for atmospheric dryness and wind pressure,</w:t>
-      </w:r>
-      <w:r>
-        <w:t xml:space="preserve"> </w:t>
-      </w:r>
-      <m:oMath>
-        <m:r>
-          <m:rPr>
-            <m:sty m:val="p"/>
-          </m:rPr>
-          <m:t>−</m:t>
-        </m:r>
-        <m:r>
-          <m:t>1</m:t>
-        </m:r>
-      </m:oMath>
-      <w:r>
-        <w:t xml:space="preserve"> </w:t>
-      </w:r>
-      <w:r>
-        <w:t xml:space="preserve">for antecedent rainfall and distance), mathematically preventing counterintuitive artifacts.</w:t>
+        <w:t xml:space="preserve">We enforce structural monotonic constraints within LightGBM (+1 for atmospheric dryness and wind pressure, −1 for antecedent rainfall and distance), mathematically preventing counterintuitive artifacts.</w:t>
       </w:r>
     </w:p>
     <w:p>
@@ -715,31 +504,7 @@
         <w:t xml:space="preserve">tests/</w:t>
       </w:r>
       <w:r>
-        <w:t xml:space="preserve">) running in</w:t>
-      </w:r>
-      <w:r>
-        <w:t xml:space="preserve"> </w:t>
-      </w:r>
-      <m:oMath>
-        <m:r>
-          <m:rPr>
-            <m:sty m:val="p"/>
-          </m:rPr>
-          <m:t>≈</m:t>
-        </m:r>
-        <m:r>
-          <m:t>1</m:t>
-        </m:r>
-        <m:r>
-          <m:rPr>
-            <m:nor/>
-            <m:sty m:val="p"/>
-          </m:rPr>
-          <m:t> minute</m:t>
-        </m:r>
-      </m:oMath>
-      <w:r>
-        <w:t xml:space="preserve">, verifying algebraic invariants, physical monotonicity, conformal coverage, and spatial KD-Tree queries. All code and workflows are versioned from raw ingestion (</w:t>
+        <w:t xml:space="preserve">) running in ≈1 minute, verifying algebraic invariants, physical monotonicity, conformal coverage, and spatial KD-Tree queries. All code and workflows are versioned from raw ingestion (</w:t>
       </w:r>
       <w:r>
         <w:rPr>
@@ -779,75 +544,18 @@
         <w:t xml:space="preserve"> </w:t>
       </w:r>
       <w:r>
-        <w:t xml:space="preserve">In retrospective temporal testing over</w:t>
-      </w:r>
-      <w:r>
-        <w:t xml:space="preserve"> </w:t>
-      </w:r>
-      <m:oMath>
-        <m:r>
-          <m:t>1</m:t>
-        </m:r>
-        <m:r>
-          <m:rPr>
-            <m:sty m:val="p"/>
-          </m:rPr>
-          <m:t>,</m:t>
-        </m:r>
-        <m:r>
-          <m:t>813</m:t>
-        </m:r>
-        <m:r>
-          <m:rPr>
-            <m:sty m:val="p"/>
-          </m:rPr>
-          <m:t>,</m:t>
-        </m:r>
-        <m:r>
-          <m:t>966</m:t>
-        </m:r>
-      </m:oMath>
-      <w:r>
-        <w:t xml:space="preserve"> </w:t>
-      </w:r>
-      <w:r>
-        <w:t xml:space="preserve">D2 cell-days during 2024–2025, our hybrid ignition layer</w:t>
-      </w:r>
-      <w:r>
-        <w:t xml:space="preserve"> </w:t>
-      </w:r>
-      <m:oMath>
-        <m:sSub>
-          <m:e>
-            <m:r>
-              <m:rPr>
-                <m:scr m:val="script"/>
-                <m:sty m:val="p"/>
-              </m:rPr>
-              <m:t>M</m:t>
-            </m:r>
-          </m:e>
-          <m:sub>
-            <m:r>
-              <m:t>3</m:t>
-            </m:r>
-          </m:sub>
-        </m:sSub>
-      </m:oMath>
-      <w:r>
-        <w:t xml:space="preserve"> </w:t>
-      </w:r>
-      <w:r>
-        <w:t xml:space="preserve">achieves a ROC-AUC of</w:t>
-      </w:r>
-      <w:r>
-        <w:t xml:space="preserve"> </w:t>
-      </w:r>
-      <m:oMath>
-        <m:r>
-          <m:t>0.8021</m:t>
-        </m:r>
-      </m:oMath>
+        <w:t xml:space="preserve">In retrospective temporal testing over 1 813 966 D2 cell-days during 2024–2025, our hybrid ignition layer M3 achieves a ROC-AUC of</w:t>
+      </w:r>
+      <w:r>
+        <w:t xml:space="preserve"> </w:t>
+      </w:r>
+      <w:r>
+        <w:rPr>
+          <w:b/>
+          <w:bCs/>
+        </w:rPr>
+        <w:t xml:space="preserve">0.8021</w:t>
+      </w:r>
       <w:r>
         <w:t xml:space="preserve"> </w:t>
       </w:r>
@@ -857,11 +565,13 @@
       <w:r>
         <w:t xml:space="preserve"> </w:t>
       </w:r>
-      <m:oMath>
-        <m:r>
-          <m:t>0.7534</m:t>
-        </m:r>
-      </m:oMath>
+      <w:r>
+        <w:rPr>
+          <w:b/>
+          <w:bCs/>
+        </w:rPr>
+        <w:t xml:space="preserve">0.7534</w:t>
+      </w:r>
       <w:r>
         <w:t xml:space="preserve"> </w:t>
       </w:r>
@@ -871,37 +581,13 @@
       <w:r>
         <w:t xml:space="preserve"> </w:t>
       </w:r>
-      <m:oMath>
-        <m:r>
-          <m:t>0.5173</m:t>
-        </m:r>
-      </m:oMath>
-      <w:r>
-        <w:rPr>
-          <w:b/>
-          <w:bCs/>
-        </w:rPr>
-        <w:t xml:space="preserve"> </w:t>
-      </w:r>
-      <w:r>
-        <w:rPr>
-          <w:b/>
-          <w:bCs/>
-        </w:rPr>
-        <w:t xml:space="preserve">/</w:t>
-      </w:r>
-      <w:r>
-        <w:rPr>
-          <w:b/>
-          <w:bCs/>
-        </w:rPr>
-        <w:t xml:space="preserve"> </w:t>
-      </w:r>
-      <m:oMath>
-        <m:r>
-          <m:t>0.5564</m:t>
-        </m:r>
-      </m:oMath>
+      <w:r>
+        <w:rPr>
+          <w:b/>
+          <w:bCs/>
+        </w:rPr>
+        <w:t xml:space="preserve">0.5173 / 0.5564</w:t>
+      </w:r>
       <w:r>
         <w:t xml:space="preserve"> </w:t>
       </w:r>
@@ -911,175 +597,34 @@
       <w:r>
         <w:t xml:space="preserve"> </w:t>
       </w:r>
-      <m:oMath>
-        <m:r>
-          <m:t>0.5389</m:t>
-        </m:r>
-      </m:oMath>
-      <w:r>
-        <w:rPr>
-          <w:b/>
-          <w:bCs/>
-        </w:rPr>
-        <w:t xml:space="preserve"> </w:t>
-      </w:r>
-      <w:r>
-        <w:rPr>
-          <w:b/>
-          <w:bCs/>
-        </w:rPr>
-        <w:t xml:space="preserve">/</w:t>
-      </w:r>
-      <w:r>
-        <w:rPr>
-          <w:b/>
-          <w:bCs/>
-        </w:rPr>
-        <w:t xml:space="preserve"> </w:t>
-      </w:r>
-      <m:oMath>
-        <m:r>
-          <m:t>0.4990</m:t>
-        </m:r>
-      </m:oMath>
-      <w:r>
-        <w:t xml:space="preserve"> </w:t>
-      </w:r>
-      <w:r>
-        <w:t xml:space="preserve">for the INPE. Case-control</w:t>
-      </w:r>
-      <w:r>
-        <w:t xml:space="preserve"> </w:t>
-      </w:r>
-      <m:oMath>
-        <m:sSub>
-          <m:e>
-            <m:r>
-              <m:t>F</m:t>
-            </m:r>
-          </m:e>
-          <m:sub>
-            <m:r>
-              <m:t>0.5</m:t>
-            </m:r>
-          </m:sub>
-        </m:sSub>
-      </m:oMath>
-      <w:r>
-        <w:t xml:space="preserve"> </w:t>
-      </w:r>
-      <w:r>
-        <w:t xml:space="preserve">precision is</w:t>
-      </w:r>
-      <w:r>
-        <w:t xml:space="preserve"> </w:t>
-      </w:r>
-      <m:oMath>
-        <m:r>
-          <m:t>32.82</m:t>
-        </m:r>
-        <m:r>
-          <m:rPr>
-            <m:nor/>
-            <m:sty m:val="p"/>
-          </m:rPr>
-          <m:t> %</m:t>
-        </m:r>
-      </m:oMath>
-      <w:r>
-        <w:t xml:space="preserve"> </w:t>
-      </w:r>
-      <w:r>
-        <w:t xml:space="preserve">/</w:t>
-      </w:r>
-      <w:r>
-        <w:t xml:space="preserve"> </w:t>
-      </w:r>
-      <m:oMath>
-        <m:r>
-          <m:t>30.13</m:t>
-        </m:r>
-        <m:r>
-          <m:rPr>
-            <m:nor/>
-            <m:sty m:val="p"/>
-          </m:rPr>
-          <m:t> %</m:t>
-        </m:r>
-      </m:oMath>
-      <w:r>
-        <w:t xml:space="preserve">; after correction to population prevalence (~0.015 % / 0.041 %), operational precision is</w:t>
-      </w:r>
-      <w:r>
-        <w:t xml:space="preserve"> </w:t>
-      </w:r>
-      <m:oMath>
-        <m:r>
-          <m:t>0.082</m:t>
-        </m:r>
-        <m:r>
-          <m:rPr>
-            <m:nor/>
-            <m:sty m:val="p"/>
-          </m:rPr>
-          <m:t> %</m:t>
-        </m:r>
-      </m:oMath>
-      <w:r>
-        <w:t xml:space="preserve"> </w:t>
-      </w:r>
-      <w:r>
-        <w:t xml:space="preserve">/</w:t>
-      </w:r>
-      <w:r>
-        <w:t xml:space="preserve"> </w:t>
-      </w:r>
-      <m:oMath>
-        <m:r>
-          <m:t>0.198</m:t>
-        </m:r>
-        <m:r>
-          <m:rPr>
-            <m:nor/>
-            <m:sty m:val="p"/>
-          </m:rPr>
-          <m:t> %</m:t>
-        </m:r>
-      </m:oMath>
-      <w:r>
-        <w:t xml:space="preserve">. Tactical propagation achieves ROC-AUC</w:t>
-      </w:r>
-      <w:r>
-        <w:t xml:space="preserve"> </w:t>
-      </w:r>
-      <m:oMath>
-        <m:r>
-          <m:t>0.9039</m:t>
-        </m:r>
-      </m:oMath>
-      <w:r>
-        <w:t xml:space="preserve"> </w:t>
-      </w:r>
-      <w:r>
-        <w:t xml:space="preserve">(Chaco) and population precision</w:t>
-      </w:r>
-      <w:r>
-        <w:t xml:space="preserve"> </w:t>
-      </w:r>
-      <m:oMath>
-        <m:r>
-          <m:t>9.67</m:t>
-        </m:r>
-        <m:r>
-          <m:rPr>
-            <m:nor/>
-            <m:sty m:val="p"/>
-          </m:rPr>
-          <m:t> %</m:t>
-        </m:r>
-      </m:oMath>
-      <w:r>
-        <w:t xml:space="preserve">. The 2023 validation selected M3 for temporal nowcasting and M2 as the operational fallback; M1 was rejected as a fallback. These corrected metrics are the honest operational benchmark.</w:t>
+      <w:r>
+        <w:rPr>
+          <w:b/>
+          <w:bCs/>
+        </w:rPr>
+        <w:t xml:space="preserve">0.5389 / 0.4990</w:t>
+      </w:r>
+      <w:r>
+        <w:t xml:space="preserve"> </w:t>
+      </w:r>
+      <w:r>
+        <w:t xml:space="preserve">for the INPE. Case-control F0.5 precision is 32.82 % / 30.13 %; after correction to population prevalence (~0.015 % / 0.041 %), operational precision is 0.082 % / 0.198 %. Tactical propagation achieves ROC-AUC</w:t>
+      </w:r>
+      <w:r>
+        <w:t xml:space="preserve"> </w:t>
+      </w:r>
+      <w:r>
+        <w:rPr>
+          <w:b/>
+          <w:bCs/>
+        </w:rPr>
+        <w:t xml:space="preserve">0.9039</w:t>
+      </w:r>
+      <w:r>
+        <w:t xml:space="preserve"> </w:t>
+      </w:r>
+      <w:r>
+        <w:t xml:space="preserve">(Chaco) and population precision 9.67 %. The 2023 validation selected M3 for temporal nowcasting and M2 as the operational fallback; M1 was rejected as a fallback. These corrected metrics are the honest operational benchmark.</w:t>
       </w:r>
     </w:p>
     <w:bookmarkEnd w:id="10"/>
@@ -1219,6 +764,12 @@
           <w:rStyle w:val="VerbatimChar"/>
         </w:rPr>
         <w:t xml:space="preserve">sanchez.martin093@gmail.com</w:t>
+      </w:r>
+      <w:r>
+        <w:br/>
+      </w:r>
+      <w:r>
+        <w:t xml:space="preserve">Phone: +595 971 907 727</w:t>
       </w:r>
       <w:r>
         <w:br/>

</xml_diff>